<commit_message>
file new for feature is added
</commit_message>
<xml_diff>
--- a/new for feature.docx
+++ b/new for feature.docx
@@ -12,7 +12,20 @@
         <w:rPr>
           <w:lang w:val="en-US"/>
         </w:rPr>
-        <w:t>heeloo</w:t>
+        <w:t>H</w:t>
+      </w:r>
+      <w:r>
+        <w:rPr>
+          <w:lang w:val="en-US"/>
+        </w:rPr>
+        <w:t>eeloo</w:t>
+      </w:r>
+      <w:r>
+        <w:rPr>
+          <w:lang w:val="en-US"/>
+        </w:rPr>
+        <w:br/>
+        <w:t>this file is added</w:t>
       </w:r>
     </w:p>
     <w:sectPr>

</xml_diff>